<commit_message>
Complete Week 3 deliverables: script, report, and policy audit log
</commit_message>
<xml_diff>
--- a/Security_Policy_Review_Report_Automation.docx
+++ b/Security_Policy_Review_Report_Automation.docx
@@ -1286,194 +1286,6 @@
         <w:t xml:space="preserve"> Meets Article 32 mandates for technical and organizational measures to ensure processing security.</w:t>
       </w:r>
     </w:p>
-    <w:p>
-      <w:pPr>
-        <w:keepNext/>
-        <w:spacing w:before="360" w:after="120"/>
-      </w:pPr>
-      <w:r>
-        <w:rPr>
-          <w:rFonts w:ascii="Calibri" w:hAnsi="Calibri"/>
-          <w:b/>
-          <w:color w:val="102C57"/>
-          <w:sz w:val="32"/>
-        </w:rPr>
-        <w:t>7. Automated Policy Compliance Audit Tool (Python)</w:t>
-      </w:r>
-    </w:p>
-    <w:p>
-      <w:pPr>
-        <w:spacing w:before="0" w:after="120" w:line="276" w:lineRule="auto"/>
-      </w:pPr>
-      <w:r>
-        <w:rPr>
-          <w:rFonts w:ascii="Calibri" w:hAnsi="Calibri"/>
-          <w:color w:val="222222"/>
-          <w:sz w:val="22"/>
-        </w:rPr>
-        <w:t>To automate continuous compliance verification against these policy recommendations, the following custom Python script (`SecurityPolicyAudit.py`) performs automated endpoint configuration checks, password policy validation, and local encryption audits.</w:t>
-      </w:r>
-    </w:p>
-    <w:tbl>
-      <w:tblPr>
-        <w:tblW w:type="auto" w:w="0"/>
-        <w:jc w:val="center"/>
-        <w:tblLook w:firstColumn="1" w:firstRow="1" w:lastColumn="0" w:lastRow="0" w:noHBand="0" w:noVBand="1" w:val="04A0"/>
-      </w:tblPr>
-      <w:tblGrid>
-        <w:gridCol w:w="9360"/>
-      </w:tblGrid>
-      <w:tr>
-        <w:tc>
-          <w:tcPr>
-            <w:tcW w:type="dxa" w:w="9360"/>
-            <w:shd w:fill="F4F6F9"/>
-            <w:tcMar>
-              <w:top w:w="140" w:type="dxa"/>
-              <w:bottom w:w="140" w:type="dxa"/>
-              <w:left w:w="180" w:type="dxa"/>
-              <w:right w:w="180" w:type="dxa"/>
-            </w:tcMar>
-            <w:tcBorders>
-              <w:left w:val="single" w:sz="24" w:space="0" w:color="102C57"/>
-              <w:top w:val="none"/>
-              <w:right w:val="none"/>
-              <w:bottom w:val="none"/>
-            </w:tcBorders>
-          </w:tcPr>
-          <w:p>
-            <w:pPr>
-              <w:spacing w:before="0" w:after="0" w:line="252" w:lineRule="auto"/>
-            </w:pPr>
-            <w:r>
-              <w:rPr>
-                <w:rFonts w:ascii="Consolas" w:hAnsi="Consolas"/>
-                <w:color w:val="282828"/>
-                <w:sz w:val="19"/>
-              </w:rPr>
-              <w:t>import os</w:t>
-              <w:br/>
-              <w:t>import sys</w:t>
-              <w:br/>
-              <w:t>import json</w:t>
-              <w:br/>
-              <w:t>import datetime</w:t>
-              <w:br/>
-              <w:t>import logging</w:t>
-              <w:br/>
-              <w:t>import platform</w:t>
-              <w:br/>
-              <w:t>import subprocess</w:t>
-              <w:br/>
-              <w:br/>
-              <w:t>logging.basicConfig(</w:t>
-              <w:br/>
-              <w:t xml:space="preserve">    filename='policy_audit.log',</w:t>
-              <w:br/>
-              <w:t xml:space="preserve">    level=logging.INFO,</w:t>
-              <w:br/>
-              <w:t xml:space="preserve">    format='%(asctime)s [%(levelname)s] %(message)s'</w:t>
-              <w:br/>
-              <w:t>)</w:t>
-              <w:br/>
-              <w:br/>
-              <w:t>class SecurityPolicyAuditor:</w:t>
-              <w:br/>
-              <w:t xml:space="preserve">    """Automates host-level security policy evaluation against ISO 27001 &amp; NIST 800-53 benchmarks."""</w:t>
-              <w:br/>
-              <w:t xml:space="preserve">    def __init__(self):</w:t>
-              <w:br/>
-              <w:t xml:space="preserve">        self.timestamp = datetime.datetime.now(datetime.timezone.utc).isoformat()</w:t>
-              <w:br/>
-              <w:t xml:space="preserve">        self.os_type = platform.system()</w:t>
-              <w:br/>
-              <w:t xml:space="preserve">        self.results = []</w:t>
-              <w:br/>
-              <w:br/>
-              <w:t xml:space="preserve">    def audit_disk_encryption(self):</w:t>
-              <w:br/>
-              <w:t xml:space="preserve">        """Check for mandatory AES-256 disk encryption (BitLocker / FileVault)."""</w:t>
-              <w:br/>
-              <w:t xml:space="preserve">        status = "Non-Compliant"</w:t>
-              <w:br/>
-              <w:t xml:space="preserve">        if self.os_type == "Windows":</w:t>
-              <w:br/>
-              <w:t xml:space="preserve">            try:</w:t>
-              <w:br/>
-              <w:t xml:space="preserve">                out = subprocess.check_output(["manage-bde", "-status"], stderr=subprocess.STREQUAL).decode()</w:t>
-              <w:br/>
-              <w:t xml:space="preserve">                if "Protection On" in out:</w:t>
-              <w:br/>
-              <w:t xml:space="preserve">                    status = "Compliant"</w:t>
-              <w:br/>
-              <w:t xml:space="preserve">            except Exception:</w:t>
-              <w:br/>
-              <w:t xml:space="preserve">                status = "Audit Failed (Elevated Privileges Required)"</w:t>
-              <w:br/>
-              <w:t xml:space="preserve">        elif self.os_type == "Darwin":</w:t>
-              <w:br/>
-              <w:t xml:space="preserve">            try:</w:t>
-              <w:br/>
-              <w:t xml:space="preserve">                out = subprocess.check_output(["fdesetup", "status"]).decode()</w:t>
-              <w:br/>
-              <w:t xml:space="preserve">                if "FileVault is On" in out:</w:t>
-              <w:br/>
-              <w:t xml:space="preserve">                    status = "Compliant"</w:t>
-              <w:br/>
-              <w:t xml:space="preserve">            except Exception:</w:t>
-              <w:br/>
-              <w:t xml:space="preserve">                status = "Audit Failed"</w:t>
-              <w:br/>
-              <w:t xml:space="preserve">        </w:t>
-              <w:br/>
-              <w:t xml:space="preserve">        self.results.append({</w:t>
-              <w:br/>
-              <w:t xml:space="preserve">            "control": "ISO 27001 A.8.24 - Data Encryption at Rest",</w:t>
-              <w:br/>
-              <w:t xml:space="preserve">            "benchmark": "Mandatory Full-Disk Encryption",</w:t>
-              <w:br/>
-              <w:t xml:space="preserve">            "status": status</w:t>
-              <w:br/>
-              <w:t xml:space="preserve">        })</w:t>
-              <w:br/>
-              <w:t xml:space="preserve">        logging.info(f"Disk Encryption Audit: {status}")</w:t>
-              <w:br/>
-              <w:br/>
-              <w:t xml:space="preserve">    def generate_compliance_report(self) -&gt; str:</w:t>
-              <w:br/>
-              <w:t xml:space="preserve">        report = {</w:t>
-              <w:br/>
-              <w:t xml:space="preserve">            "audit_title": "Enterprise Security Policy Compliance Scan",</w:t>
-              <w:br/>
-              <w:t xml:space="preserve">            "timestamp": self.timestamp,</w:t>
-              <w:br/>
-              <w:t xml:space="preserve">            "host_info": {</w:t>
-              <w:br/>
-              <w:t xml:space="preserve">                "hostname": platform.node(),</w:t>
-              <w:br/>
-              <w:t xml:space="preserve">                "os": f"{self.os_type} {platform.release()}"</w:t>
-              <w:br/>
-              <w:t xml:space="preserve">            },</w:t>
-              <w:br/>
-              <w:t xml:space="preserve">            "evaluations": self.results</w:t>
-              <w:br/>
-              <w:t xml:space="preserve">        }</w:t>
-              <w:br/>
-              <w:t xml:space="preserve">        return json.dumps(report, indent=4)</w:t>
-              <w:br/>
-              <w:br/>
-              <w:t>if __name__ == "__main__":</w:t>
-              <w:br/>
-              <w:t xml:space="preserve">    auditor = SecurityPolicyAuditor()</w:t>
-              <w:br/>
-              <w:t xml:space="preserve">    auditor.audit_disk_encryption()</w:t>
-              <w:br/>
-              <w:t xml:space="preserve">    print(auditor.generate_compliance_report())</w:t>
-            </w:r>
-          </w:p>
-        </w:tc>
-      </w:tr>
-    </w:tbl>
     <w:sectPr>
       <w:pgSz w:w="12240" w:h="15840"/>
       <w:pgMar w:top="1440" w:right="1440" w:bottom="1440" w:left="1440" w:header="720" w:footer="720" w:gutter="0"/>

</xml_diff>